<commit_message>
Actualizar guia Word, configuracion devcontainer y soporte codespaces
</commit_message>
<xml_diff>
--- a/Guia_Despliegue_Revista_Ceibo.docx
+++ b/Guia_Despliegue_Revista_Ceibo.docx
@@ -1437,7 +1437,7 @@
           <w:color w:val="1A365D"/>
           <w:sz w:val="26"/>
         </w:rPr>
-        <w:t xml:space="preserve">2. Guía Paso a Paso: Cómo Levantar el Docker desde Cero en otra Computadora</w:t>
+        <w:t xml:space="preserve">2. Despliegue en la Nube con GitHub Codespaces (Recomendado)</w:t>
       </w:r>
     </w:p>
     <w:p>
@@ -1449,7 +1449,220 @@
           <w:color w:val="2D3748"/>
           <w:sz w:val="21"/>
         </w:rPr>
-        <w:t xml:space="preserve">Este entorno de práctica es totalmente autónomo y compatible con cualquier sistema operativo: macOS (Apple Silicon M1/M2/M3/M4 o Intel), Linux (Ubuntu, Debian, Fedora) y Windows 10/11 con Docker Desktop.</w:t>
+        <w:t xml:space="preserve">Esta es la opción más sencilla y recomendada para estudiantes y docentes, ya que no requiere instalar Docker ni configurar nada en la computadora personal. Todo se ejecuta en los servidores de GitHub y se accede a través del navegador web.</w:t>
+      </w:r>
+    </w:p>
+    <w:p>
+      <w:pPr>
+        <w:pBdr>
+          <w:top w:val="single" w:sz="4" w:space="4" w:color="BEE3F8"/>
+          <w:left w:val="single" w:sz="24" w:space="8" w:color="2B6CB0"/>
+          <w:bottom w:val="single" w:sz="4" w:space="4" w:color="BEE3F8"/>
+          <w:right w:val="single" w:sz="4" w:space="4" w:color="BEE3F8"/>
+        </w:pBdr>
+        <w:shd w:val="clear" w:color="auto" w:fill="EBF8FF"/>
+        <w:spacing w:before="140" w:after="180"/>
+        <w:ind w:left="240" w:right="240"/>
+      </w:pPr>
+      <w:r>
+        <w:rPr>
+          <w:b/>
+          <w:color w:val="2B6CB0"/>
+          <w:sz w:val="20"/>
+        </w:rPr>
+        <w:t xml:space="preserve">Beneficio Principal: </w:t>
+      </w:r>
+      <w:r>
+        <w:rPr>
+          <w:color w:val="2D3748"/>
+          <w:sz w:val="20"/>
+        </w:rPr>
+        <w:t xml:space="preserve">Permite que los estudiantes ingresen con cualquier rol editorial (autor, revisor, editor), realicen envíos de artículos y publiquen números completos desde cualquier dispositivo, incluso desde computadoras institucionales o portátiles con recursos limitados.</w:t>
+      </w:r>
+    </w:p>
+    <w:p>
+      <w:pPr>
+        <w:spacing w:before="140" w:after="60"/>
+      </w:pPr>
+      <w:r>
+        <w:rPr>
+          <w:b/>
+          <w:color w:val="2B6CB0"/>
+          <w:sz w:val="22"/>
+        </w:rPr>
+        <w:t xml:space="preserve">Paso 1: Abrir el Repositorio en GitHub</w:t>
+      </w:r>
+    </w:p>
+    <w:p>
+      <w:pPr>
+        <w:spacing w:before="0" w:after="40"/>
+      </w:pPr>
+      <w:r>
+        <w:rPr>
+          <w:color w:val="2D3748"/>
+          <w:sz w:val="21"/>
+        </w:rPr>
+        <w:t xml:space="preserve">1. Inicie sesión en su cuenta personal de GitHub (https://github.com).</w:t>
+      </w:r>
+    </w:p>
+    <w:p>
+      <w:pPr>
+        <w:spacing w:before="0" w:after="120"/>
+      </w:pPr>
+      <w:r>
+        <w:rPr>
+          <w:color w:val="2D3748"/>
+          <w:sz w:val="21"/>
+        </w:rPr>
+        <w:t xml:space="preserve">2. Ingrese al enlace del repositorio de la revista proporcionado por el docente.</w:t>
+      </w:r>
+    </w:p>
+    <w:p>
+      <w:pPr>
+        <w:spacing w:before="140" w:after="60"/>
+      </w:pPr>
+      <w:r>
+        <w:rPr>
+          <w:b/>
+          <w:color w:val="2B6CB0"/>
+          <w:sz w:val="22"/>
+        </w:rPr>
+        <w:t xml:space="preserve">Paso 2: Crear el Entorno Codespace</w:t>
+      </w:r>
+    </w:p>
+    <w:p>
+      <w:pPr>
+        <w:spacing w:before="0" w:after="40"/>
+      </w:pPr>
+      <w:r>
+        <w:rPr>
+          <w:color w:val="2D3748"/>
+          <w:sz w:val="21"/>
+        </w:rPr>
+        <w:t xml:space="preserve">1. En la parte superior derecha del repositorio, haga clic en el botón verde llamado Code.</w:t>
+      </w:r>
+    </w:p>
+    <w:p>
+      <w:pPr>
+        <w:spacing w:before="0" w:after="40"/>
+      </w:pPr>
+      <w:r>
+        <w:rPr>
+          <w:color w:val="2D3748"/>
+          <w:sz w:val="21"/>
+        </w:rPr>
+        <w:t xml:space="preserve">2. Seleccione la pestaña Codespaces en el menú desplegable.</w:t>
+      </w:r>
+    </w:p>
+    <w:p>
+      <w:pPr>
+        <w:spacing w:before="0" w:after="120"/>
+      </w:pPr>
+      <w:r>
+        <w:rPr>
+          <w:color w:val="2D3748"/>
+          <w:sz w:val="21"/>
+        </w:rPr>
+        <w:t xml:space="preserve">3. Haga clic en el botón Create codespace on main.</w:t>
+      </w:r>
+    </w:p>
+    <w:p>
+      <w:pPr>
+        <w:spacing w:before="140" w:after="60"/>
+      </w:pPr>
+      <w:r>
+        <w:rPr>
+          <w:b/>
+          <w:color w:val="2B6CB0"/>
+          <w:sz w:val="22"/>
+        </w:rPr>
+        <w:t xml:space="preserve">Paso 3: Esperar la Inicialización Automática</w:t>
+      </w:r>
+    </w:p>
+    <w:p>
+      <w:pPr>
+        <w:spacing w:before="0" w:after="120"/>
+      </w:pPr>
+      <w:r>
+        <w:rPr>
+          <w:color w:val="2D3748"/>
+          <w:sz w:val="21"/>
+        </w:rPr>
+        <w:t xml:space="preserve">GitHub creará una máquina virtual con Linux, descargará las imágenes de OJS y MariaDB, e iniciará la revista de manera 100% automática. Este proceso toma entre 1 y 2 minutos la primera vez.</w:t>
+      </w:r>
+    </w:p>
+    <w:p>
+      <w:pPr>
+        <w:spacing w:before="140" w:after="60"/>
+      </w:pPr>
+      <w:r>
+        <w:rPr>
+          <w:b/>
+          <w:color w:val="2B6CB0"/>
+          <w:sz w:val="22"/>
+        </w:rPr>
+        <w:t xml:space="preserve">Paso 4: Abrir la Revista en el Navegador</w:t>
+      </w:r>
+    </w:p>
+    <w:p>
+      <w:pPr>
+        <w:spacing w:before="0" w:after="40"/>
+      </w:pPr>
+      <w:r>
+        <w:rPr>
+          <w:color w:val="2D3748"/>
+          <w:sz w:val="21"/>
+        </w:rPr>
+        <w:t xml:space="preserve">1. Al completarse el inicio, aparecerá una notificación emergente en la esquina inferior derecha con el botón Open in Browser (Abrir en el navegador).</w:t>
+      </w:r>
+    </w:p>
+    <w:p>
+      <w:pPr>
+        <w:spacing w:before="0" w:after="40"/>
+      </w:pPr>
+      <w:r>
+        <w:rPr>
+          <w:color w:val="2D3748"/>
+          <w:sz w:val="21"/>
+        </w:rPr>
+        <w:t xml:space="preserve">2. Al hacer clic, se abrirá una nueva pestaña con la Revista Ceibo en su dirección web segura de GitHub (por ejemplo: https://nombre-codespace-8080.app.github.dev).</w:t>
+      </w:r>
+    </w:p>
+    <w:p>
+      <w:pPr>
+        <w:spacing w:before="0" w:after="140"/>
+      </w:pPr>
+      <w:r>
+        <w:rPr>
+          <w:color w:val="2D3748"/>
+          <w:sz w:val="21"/>
+        </w:rPr>
+        <w:t xml:space="preserve">3. Si la ventana emergente no aparece, haga clic en la pestaña Ports en la barra inferior, busque el puerto 8080 y haga clic en el icono del globo terráqueo.</w:t>
+      </w:r>
+    </w:p>
+    <w:p>
+      <w:pPr>
+        <w:spacing w:before="240" w:after="120"/>
+      </w:pPr>
+      <w:r>
+        <w:rPr>
+          <w:b/>
+          <w:color w:val="1A365D"/>
+          <w:sz w:val="26"/>
+        </w:rPr>
+        <w:t xml:space="preserve">3. Ejecución Local con Docker Desktop en otra Computadora</w:t>
+      </w:r>
+    </w:p>
+    <w:p>
+      <w:pPr>
+        <w:spacing w:before="40" w:after="140"/>
+      </w:pPr>
+      <w:r>
+        <w:rPr>
+          <w:color w:val="2D3748"/>
+          <w:sz w:val="21"/>
+        </w:rPr>
+        <w:t xml:space="preserve">Si prefiere trabajar sin conexión a internet o de manera local, este entorno es compatible con cualquier sistema operativo: macOS (Apple Silicon M1/M2/M3/M4 o Intel), Linux (Ubuntu, Debian, Fedora) y Windows 10/11 con Docker Desktop.</w:t>
       </w:r>
     </w:p>
     <w:p>

</xml_diff>